<commit_message>
docs(avance-3): completa anexos C y tablas de responsabilidades
El informe tenía la tabla de responsabilidades y la columna de responsables
del plan de sustentación vacías, y el Anexo C remitía a la entrega anterior
para el cronograma y el flujo del proceso. Se añaden las figuras C.3
(cronograma real desde el CHANGELOG) y C.4 (BPMN del proceso central),
se corrigen los conteos de páginas del frontend y del historial de Git,
y se documenta el aporte de cada integrante.
</commit_message>
<xml_diff>
--- a/docs/AutoGestion_Avance_Proyecto_Final_3_COMPLETO.docx
+++ b/docs/AutoGestion_Avance_Proyecto_Final_3_COMPLETO.docx
@@ -6531,7 +6531,7 @@
         <w:spacing w:after="120" w:line="276"/>
       </w:pPr>
       <w:r>
-        <w:t xml:space="preserve">Distribución de responsabilidades por integrante (completar con el área real de cada uno):</w:t>
+        <w:t>Distribución de responsabilidades según los módulos que cada integrante construyó; el detalle de los aportes queda evidenciado en el Anexo D.</w:t>
       </w:r>
     </w:p>
     <w:tbl>
@@ -6685,7 +6685,7 @@
                 <w:sz w:val="19"/>
                 <w:szCs w:val="19"/>
               </w:rPr>
-              <w:t xml:space="preserve"/>
+              <w:t>Interfaces gráficas y módulo comercial: pantallas del personal y del portal, recepción de vehículos, clientes y catálogo (ClienteService, VehiculoService, RecepcionService).</w:t>
             </w:r>
           </w:p>
         </w:tc>
@@ -6754,7 +6754,7 @@
                 <w:sz w:val="19"/>
                 <w:szCs w:val="19"/>
               </w:rPr>
-              <w:t xml:space="preserve"/>
+              <w:t>Módulos operativos del taller: diagnóstico, órdenes de trabajo e inventario con alertas de stock (DiagnosticoService, OrdenTrabajoService, InventarioService).</w:t>
             </w:r>
           </w:p>
         </w:tc>
@@ -6825,7 +6825,7 @@
                 <w:sz w:val="19"/>
                 <w:szCs w:val="19"/>
               </w:rPr>
-              <w:t xml:space="preserve"/>
+              <w:t>Arquitectura, seguridad y portal del cliente: JWT y roles, consulta DNI/RUC con el patrón Strategy, solicitudes de cotización y control de versiones (SecurityConfig, PortalService, ConsultaDocumentoService).</w:t>
             </w:r>
           </w:p>
         </w:tc>
@@ -6894,7 +6894,7 @@
                 <w:sz w:val="19"/>
                 <w:szCs w:val="19"/>
               </w:rPr>
-              <w:t xml:space="preserve"/>
+              <w:t>Comprobantes, pagos y reportes: boleta y factura con serie y correlativo, registro de pagos y exportación a Excel y PDF (ComprobanteService, PagoEntregaService, ReporteExcelGenerator, ReportePdfGenerator).</w:t>
             </w:r>
           </w:p>
         </w:tc>
@@ -6965,7 +6965,7 @@
                 <w:sz w:val="19"/>
                 <w:szCs w:val="19"/>
               </w:rPr>
-              <w:t xml:space="preserve"/>
+              <w:t>Calidad y documentación: 24 clases de prueba con JUnit 5 y Mockito, Javadoc, README, CHANGELOG y despliegue con Docker Compose.</w:t>
             </w:r>
           </w:p>
         </w:tc>
@@ -6985,7 +6985,7 @@
         <w:spacing w:after="120" w:line="276"/>
       </w:pPr>
       <w:r>
-        <w:t xml:space="preserve">La interfaz usa un estilo industrial (acero, aceite y señalización), modo claro/oscuro, animaciones que respetan prefers-reduced-motion y diseño adaptable. El sistema entrega 26 páginas: login del personal, 14 pantallas administrativas (dashboard, recepción, clientes, cotización, órdenes de trabajo, inventario, pago/entrega, equipo, reportes, paneles de mecánico y recepcionista, tutorial, acceso denegado y políticas) y 10 pantallas del portal del cliente.</w:t>
+        <w:t>La interfaz usa un estilo industrial (acero, aceite y señalización), modo claro/oscuro, animaciones que respetan prefers-reduced-motion y diseño adaptable. El sistema entrega 26 páginas: 15 del personal (login y 14 pantallas administrativas) y 11 del portal del cliente (pantalla de acceso y 10 secciones).</w:t>
       </w:r>
     </w:p>
     <w:p>
@@ -8072,7 +8072,7 @@
                 <w:sz w:val="19"/>
                 <w:szCs w:val="19"/>
               </w:rPr>
-              <w:t xml:space="preserve"/>
+              <w:t>Benites Moran</w:t>
             </w:r>
           </w:p>
         </w:tc>
@@ -8205,7 +8205,7 @@
                 <w:sz w:val="19"/>
                 <w:szCs w:val="19"/>
               </w:rPr>
-              <w:t xml:space="preserve"/>
+              <w:t>Valle Cobeñas</w:t>
             </w:r>
           </w:p>
         </w:tc>
@@ -8342,7 +8342,7 @@
                 <w:sz w:val="19"/>
                 <w:szCs w:val="19"/>
               </w:rPr>
-              <w:t xml:space="preserve"/>
+              <w:t>Valle Cobeñas</w:t>
             </w:r>
           </w:p>
         </w:tc>
@@ -8475,7 +8475,7 @@
                 <w:sz w:val="19"/>
                 <w:szCs w:val="19"/>
               </w:rPr>
-              <w:t xml:space="preserve"/>
+              <w:t>Zegarra Requejo</w:t>
             </w:r>
           </w:p>
         </w:tc>
@@ -8612,7 +8612,7 @@
                 <w:sz w:val="19"/>
                 <w:szCs w:val="19"/>
               </w:rPr>
-              <w:t xml:space="preserve"/>
+              <w:t>Zapata Sanchez</w:t>
             </w:r>
           </w:p>
         </w:tc>
@@ -8745,7 +8745,7 @@
                 <w:sz w:val="19"/>
                 <w:szCs w:val="19"/>
               </w:rPr>
-              <w:t xml:space="preserve"/>
+              <w:t>Valle Cobeñas</w:t>
             </w:r>
           </w:p>
         </w:tc>
@@ -8882,7 +8882,7 @@
                 <w:sz w:val="19"/>
                 <w:szCs w:val="19"/>
               </w:rPr>
-              <w:t xml:space="preserve"/>
+              <w:t>Benites y Kung</w:t>
             </w:r>
           </w:p>
         </w:tc>
@@ -9167,7 +9167,7 @@
         <w:spacing w:after="120" w:line="276"/>
       </w:pPr>
       <w:r>
-        <w:t>Anexo C. Diagramas del proyecto. C.1 Modelo de datos del núcleo operativo, elaborado desde las migraciones Flyway V1–V9. C.2 Arquitectura por capas (MVC + DAO + SOLID) y seguridad transversal. Los diagramas de Gantt, BPMN y clases UML del Avance 2 se mantienen en el informe de esa entrega.</w:t>
+        <w:t>Anexo C. Diagramas del proyecto. C.1 Modelo de datos del núcleo operativo, elaborado desde las migraciones Flyway V1–V9. C.2 Arquitectura por capas (MVC + DAO + SOLID) y seguridad transversal. C.3 Cronograma real del proyecto con las fases entre las versiones del CHANGELOG. C.4 Flujo BPMN simplificado del proceso central, del ingreso del vehículo a la entrega con comprobante.</w:t>
       </w:r>
     </w:p>
     <w:p>
@@ -9268,10 +9268,106 @@
     </w:p>
     <w:p>
       <w:pPr>
+        <w:jc w:val="center"/>
+      </w:pPr>
+      <w:r>
+        <w:drawing>
+          <wp:inline xmlns:a="http://schemas.openxmlformats.org/drawingml/2006/main" xmlns:pic="http://schemas.openxmlformats.org/drawingml/2006/picture">
+            <wp:extent cx="5577840" cy="3242119"/>
+            <wp:docPr id="6" name="Picture 6"/>
+            <wp:cNvGraphicFramePr>
+              <a:graphicFrameLocks noChangeAspect="1"/>
+            </wp:cNvGraphicFramePr>
+            <a:graphic>
+              <a:graphicData uri="http://schemas.openxmlformats.org/drawingml/2006/picture">
+                <pic:pic>
+                  <pic:nvPicPr>
+                    <pic:cNvPr id="0" name="anexo-c2-arquitectura.png"/>
+                    <pic:cNvPicPr/>
+                  </pic:nvPicPr>
+                  <pic:blipFill>
+                    <a:blip r:embed="rId23"/>
+                    <a:stretch>
+                      <a:fillRect/>
+                    </a:stretch>
+                  </pic:blipFill>
+                  <pic:spPr>
+                    <a:xfrm>
+                      <a:off x="0" y="0"/>
+                      <a:ext cx="5577840" cy="3416427"/>
+                    </a:xfrm>
+                    <a:prstGeom prst="rect"/>
+                  </pic:spPr>
+                </pic:pic>
+              </a:graphicData>
+            </a:graphic>
+          </wp:inline>
+        </w:drawing>
+      </w:r>
+    </w:p>
+    <w:p>
+      <w:r>
+        <w:rPr>
+          <w:i/>
+          <w:sz w:val="18"/>
+        </w:rPr>
+        <w:t>Figura C.3. Cronograma del proyecto: fases de desarrollo entre las versiones publicadas en el CHANGELOG (v1.0.0 a v2.14.0).</w:t>
+      </w:r>
+    </w:p>
+    <w:p>
+      <w:pPr>
+        <w:jc w:val="center"/>
+      </w:pPr>
+      <w:r>
+        <w:drawing>
+          <wp:inline xmlns:a="http://schemas.openxmlformats.org/drawingml/2006/main" xmlns:pic="http://schemas.openxmlformats.org/drawingml/2006/picture">
+            <wp:extent cx="5577840" cy="3137535"/>
+            <wp:docPr id="6" name="Picture 6"/>
+            <wp:cNvGraphicFramePr>
+              <a:graphicFrameLocks noChangeAspect="1"/>
+            </wp:cNvGraphicFramePr>
+            <a:graphic>
+              <a:graphicData uri="http://schemas.openxmlformats.org/drawingml/2006/picture">
+                <pic:pic>
+                  <pic:nvPicPr>
+                    <pic:cNvPr id="0" name="anexo-c2-arquitectura.png"/>
+                    <pic:cNvPicPr/>
+                  </pic:nvPicPr>
+                  <pic:blipFill>
+                    <a:blip r:embed="rId24"/>
+                    <a:stretch>
+                      <a:fillRect/>
+                    </a:stretch>
+                  </pic:blipFill>
+                  <pic:spPr>
+                    <a:xfrm>
+                      <a:off x="0" y="0"/>
+                      <a:ext cx="5577840" cy="3416427"/>
+                    </a:xfrm>
+                    <a:prstGeom prst="rect"/>
+                  </pic:spPr>
+                </pic:pic>
+              </a:graphicData>
+            </a:graphic>
+          </wp:inline>
+        </w:drawing>
+      </w:r>
+    </w:p>
+    <w:p>
+      <w:r>
+        <w:rPr>
+          <w:i/>
+          <w:sz w:val="18"/>
+        </w:rPr>
+        <w:t>Figura C.4. Flujo del proceso central en BPMN simplificado, con el rol que ejecuta cada actividad.</w:t>
+      </w:r>
+    </w:p>
+    <w:p>
+      <w:pPr>
         <w:spacing w:after="120" w:line="276"/>
       </w:pPr>
       <w:r>
-        <w:t>Anexo D. Evidencia de GitHub. D.1 Historial de commits sobre main: 65 commits con mensajes por intención y un único autor (javier-valle). D.2 Contribuidores del repositorio: javier-valle (51 commits) y WenliangK (7 commits). No se utilizaron Pull Requests ni tags.</w:t>
+        <w:t>Anexo D. Evidencia de GitHub. D.1 Historial de commits sobre main: 69 commits (03-sep a 29-oct-2026) con mensajes por intención (feat, fix, test, docs, refactor). D.2 Contribuidores según Insights → Contributors. No se utilizaron Pull Requests ni tags.</w:t>
       </w:r>
     </w:p>
     <w:p>

</xml_diff>